<commit_message>
Server CV: fill the full page with larger text and spacing
Co-Authored-By: Claude Opus 5.5 <noreply@anthropic.com>
Claude-Session: https://claude.ai/code/session_01MNmMoUTURwQqNjm7K6SsYQ
</commit_message>
<xml_diff>
--- a/cv/Jithin_George_Server_CV.docx
+++ b/cv/Jithin_George_Server_CV.docx
@@ -65,7 +65,7 @@
     </w:p>
     <w:p>
       <w:pPr>
-        <w:spacing w:after="60" w:before="160"/>
+        <w:spacing w:after="120" w:before="300"/>
         <w:pBdr>
           <w:bottom w:val="single" w:sz="6" w:space="2" w:color="333333"/>
         </w:pBdr>
@@ -91,7 +91,7 @@
     </w:p>
     <w:p>
       <w:pPr>
-        <w:spacing w:after="60" w:before="160"/>
+        <w:spacing w:after="120" w:before="300"/>
         <w:pBdr>
           <w:bottom w:val="single" w:sz="6" w:space="2" w:color="333333"/>
         </w:pBdr>
@@ -109,7 +109,7 @@
         <w:tabs>
           <w:tab w:pos="10091" w:val="right"/>
         </w:tabs>
-        <w:spacing w:after="20" w:before="100"/>
+        <w:spacing w:after="60" w:before="200"/>
       </w:pPr>
       <w:r>
         <w:rPr>
@@ -134,7 +134,7 @@
     <w:p>
       <w:pPr>
         <w:pStyle w:val="ListBullet"/>
-        <w:spacing w:after="20"/>
+        <w:spacing w:after="30"/>
       </w:pPr>
       <w:r>
         <w:rPr>
@@ -146,7 +146,7 @@
     <w:p>
       <w:pPr>
         <w:pStyle w:val="ListBullet"/>
-        <w:spacing w:after="20"/>
+        <w:spacing w:after="30"/>
       </w:pPr>
       <w:r>
         <w:rPr>
@@ -158,7 +158,7 @@
     <w:p>
       <w:pPr>
         <w:pStyle w:val="ListBullet"/>
-        <w:spacing w:after="20"/>
+        <w:spacing w:after="30"/>
       </w:pPr>
       <w:r>
         <w:rPr>
@@ -170,7 +170,7 @@
     <w:p>
       <w:pPr>
         <w:pStyle w:val="ListBullet"/>
-        <w:spacing w:after="20"/>
+        <w:spacing w:after="30"/>
       </w:pPr>
       <w:r>
         <w:rPr>
@@ -182,7 +182,7 @@
     <w:p>
       <w:pPr>
         <w:pStyle w:val="ListBullet"/>
-        <w:spacing w:after="20"/>
+        <w:spacing w:after="30"/>
       </w:pPr>
       <w:r>
         <w:rPr>
@@ -194,13 +194,13 @@
     <w:p>
       <w:pPr>
         <w:pStyle w:val="ListBullet"/>
-        <w:spacing w:after="20"/>
+        <w:spacing w:after="30"/>
       </w:pPr>
       <w:r>
         <w:rPr>
           <w:b w:val="0"/>
         </w:rPr>
-        <w:t>Oversaw opening and closing, cashing up, stock checks, health and safety and food hygiene compliance.</w:t>
+        <w:t>Oversaw opening and closing, cashing up, stock checks and food safety compliance.</w:t>
       </w:r>
     </w:p>
     <w:p>
@@ -208,7 +208,7 @@
         <w:tabs>
           <w:tab w:pos="10091" w:val="right"/>
         </w:tabs>
-        <w:spacing w:after="20" w:before="100"/>
+        <w:spacing w:after="60" w:before="200"/>
       </w:pPr>
       <w:r>
         <w:rPr>
@@ -233,19 +233,19 @@
     <w:p>
       <w:pPr>
         <w:pStyle w:val="ListBullet"/>
-        <w:spacing w:after="20"/>
+        <w:spacing w:after="30"/>
       </w:pPr>
       <w:r>
         <w:rPr>
           <w:b w:val="0"/>
         </w:rPr>
-        <w:t>Greeted and served guests across eat-in and takeaway during high-volume shifts with speed and warmth.</w:t>
+        <w:t>Served eat-in and takeaway guests during high-volume shifts with speed and warmth.</w:t>
       </w:r>
     </w:p>
     <w:p>
       <w:pPr>
         <w:pStyle w:val="ListBullet"/>
-        <w:spacing w:after="20"/>
+        <w:spacing w:after="30"/>
       </w:pPr>
       <w:r>
         <w:rPr>
@@ -257,7 +257,7 @@
     <w:p>
       <w:pPr>
         <w:pStyle w:val="ListBullet"/>
-        <w:spacing w:after="20"/>
+        <w:spacing w:after="30"/>
       </w:pPr>
       <w:r>
         <w:rPr>
@@ -269,7 +269,19 @@
     <w:p>
       <w:pPr>
         <w:pStyle w:val="ListBullet"/>
-        <w:spacing w:after="20"/>
+        <w:spacing w:after="30"/>
+      </w:pPr>
+      <w:r>
+        <w:rPr>
+          <w:b w:val="0"/>
+        </w:rPr>
+        <w:t>Passed orders clearly to the kitchen so food went out quickly and accurately at busy times.</w:t>
+      </w:r>
+    </w:p>
+    <w:p>
+      <w:pPr>
+        <w:pStyle w:val="ListBullet"/>
+        <w:spacing w:after="30"/>
       </w:pPr>
       <w:r>
         <w:rPr>
@@ -283,7 +295,7 @@
         <w:tabs>
           <w:tab w:pos="10091" w:val="right"/>
         </w:tabs>
-        <w:spacing w:after="20" w:before="100"/>
+        <w:spacing w:after="60" w:before="200"/>
       </w:pPr>
       <w:r>
         <w:rPr>
@@ -308,7 +320,7 @@
     <w:p>
       <w:pPr>
         <w:pStyle w:val="ListBullet"/>
-        <w:spacing w:after="20"/>
+        <w:spacing w:after="30"/>
       </w:pPr>
       <w:r>
         <w:rPr>
@@ -320,7 +332,7 @@
     <w:p>
       <w:pPr>
         <w:pStyle w:val="ListBullet"/>
-        <w:spacing w:after="20"/>
+        <w:spacing w:after="30"/>
       </w:pPr>
       <w:r>
         <w:rPr>
@@ -332,7 +344,7 @@
     <w:p>
       <w:pPr>
         <w:pStyle w:val="ListBullet"/>
-        <w:spacing w:after="20"/>
+        <w:spacing w:after="30"/>
       </w:pPr>
       <w:r>
         <w:rPr>
@@ -344,7 +356,7 @@
     <w:p>
       <w:pPr>
         <w:pStyle w:val="ListBullet"/>
-        <w:spacing w:after="20"/>
+        <w:spacing w:after="30"/>
       </w:pPr>
       <w:r>
         <w:rPr>
@@ -356,7 +368,7 @@
     <w:p>
       <w:pPr>
         <w:pStyle w:val="ListBullet"/>
-        <w:spacing w:after="20"/>
+        <w:spacing w:after="30"/>
       </w:pPr>
       <w:r>
         <w:rPr>
@@ -368,7 +380,7 @@
     <w:p>
       <w:pPr>
         <w:pStyle w:val="ListBullet"/>
-        <w:spacing w:after="20"/>
+        <w:spacing w:after="30"/>
       </w:pPr>
       <w:r>
         <w:rPr>
@@ -380,7 +392,7 @@
     <w:p>
       <w:pPr>
         <w:pStyle w:val="ListBullet"/>
-        <w:spacing w:after="20"/>
+        <w:spacing w:after="30"/>
       </w:pPr>
       <w:r>
         <w:rPr>
@@ -392,7 +404,7 @@
     <w:p>
       <w:pPr>
         <w:pStyle w:val="ListBullet"/>
-        <w:spacing w:after="20"/>
+        <w:spacing w:after="30"/>
       </w:pPr>
       <w:r>
         <w:rPr>
@@ -403,7 +415,7 @@
     </w:p>
     <w:p>
       <w:pPr>
-        <w:spacing w:after="60" w:before="160"/>
+        <w:spacing w:after="120" w:before="300"/>
         <w:pBdr>
           <w:bottom w:val="single" w:sz="6" w:space="2" w:color="333333"/>
         </w:pBdr>
@@ -463,7 +475,7 @@
     </w:p>
     <w:p>
       <w:pPr>
-        <w:spacing w:after="60" w:before="160"/>
+        <w:spacing w:after="120" w:before="300"/>
         <w:pBdr>
           <w:bottom w:val="single" w:sz="6" w:space="2" w:color="333333"/>
         </w:pBdr>
@@ -996,11 +1008,11 @@
     <w:qFormat/>
     <w:rsid w:val="00FC693F"/>
     <w:pPr>
-      <w:spacing w:after="0" w:line="240" w:lineRule="auto"/>
+      <w:spacing w:after="0" w:line="288" w:lineRule="auto"/>
     </w:pPr>
     <w:rPr>
       <w:rFonts w:ascii="Arial" w:hAnsi="Arial" w:eastAsia="Arial"/>
-      <w:sz w:val="20"/>
+      <w:sz w:val="21"/>
     </w:rPr>
   </w:style>
   <w:style w:type="paragraph" w:styleId="Header">

</xml_diff>

<commit_message>
Hospitality CVs: move Bardez above Chit n Chaat and update dates
Co-Authored-By: Claude Opus 5.5 <noreply@anthropic.com>
Claude-Session: https://claude.ai/code/session_01MNmMoUTURwQqNjm7K6SsYQ
</commit_message>
<xml_diff>
--- a/cv/Jithin_George_Server_CV.docx
+++ b/cv/Jithin_George_Server_CV.docx
@@ -220,93 +220,6 @@
         <w:rPr>
           <w:b w:val="0"/>
         </w:rPr>
-        <w:t xml:space="preserve"> – Chit n Chaat, UK</w:t>
-      </w:r>
-      <w:r>
-        <w:rPr>
-          <w:b w:val="0"/>
-        </w:rPr>
-        <w:tab/>
-        <w:t>Dec 2024 – Mar 2025</w:t>
-      </w:r>
-    </w:p>
-    <w:p>
-      <w:pPr>
-        <w:pStyle w:val="ListBullet"/>
-        <w:spacing w:after="30"/>
-      </w:pPr>
-      <w:r>
-        <w:rPr>
-          <w:b w:val="0"/>
-        </w:rPr>
-        <w:t>Served eat-in and takeaway guests during high-volume shifts with speed and warmth.</w:t>
-      </w:r>
-    </w:p>
-    <w:p>
-      <w:pPr>
-        <w:pStyle w:val="ListBullet"/>
-        <w:spacing w:after="30"/>
-      </w:pPr>
-      <w:r>
-        <w:rPr>
-          <w:b w:val="0"/>
-        </w:rPr>
-        <w:t>Guided guests through the menu and handled special requests, helping them order with confidence.</w:t>
-      </w:r>
-    </w:p>
-    <w:p>
-      <w:pPr>
-        <w:pStyle w:val="ListBullet"/>
-        <w:spacing w:after="30"/>
-      </w:pPr>
-      <w:r>
-        <w:rPr>
-          <w:b w:val="0"/>
-        </w:rPr>
-        <w:t>Stepped in to support teammates in rush periods, cutting wait times and keeping service flowing.</w:t>
-      </w:r>
-    </w:p>
-    <w:p>
-      <w:pPr>
-        <w:pStyle w:val="ListBullet"/>
-        <w:spacing w:after="30"/>
-      </w:pPr>
-      <w:r>
-        <w:rPr>
-          <w:b w:val="0"/>
-        </w:rPr>
-        <w:t>Passed orders clearly to the kitchen so food went out quickly and accurately at busy times.</w:t>
-      </w:r>
-    </w:p>
-    <w:p>
-      <w:pPr>
-        <w:pStyle w:val="ListBullet"/>
-        <w:spacing w:after="30"/>
-      </w:pPr>
-      <w:r>
-        <w:rPr>
-          <w:b w:val="0"/>
-        </w:rPr>
-        <w:t>Kept the section clean, restocked and well presented in line with food safety standards.</w:t>
-      </w:r>
-    </w:p>
-    <w:p>
-      <w:pPr>
-        <w:tabs>
-          <w:tab w:pos="10091" w:val="right"/>
-        </w:tabs>
-        <w:spacing w:after="60" w:before="200"/>
-      </w:pPr>
-      <w:r>
-        <w:rPr>
-          <w:b/>
-        </w:rPr>
-        <w:t>Front of House Staff</w:t>
-      </w:r>
-      <w:r>
-        <w:rPr>
-          <w:b w:val="0"/>
-        </w:rPr>
         <w:t xml:space="preserve"> – Bardez, UK</w:t>
       </w:r>
       <w:r>
@@ -314,7 +227,7 @@
           <w:b w:val="0"/>
         </w:rPr>
         <w:tab/>
-        <w:t>Mar 2024 – Nov 2024</w:t>
+        <w:t>Aug 2024 – Mar 2025</w:t>
       </w:r>
     </w:p>
     <w:p>
@@ -411,6 +324,93 @@
           <w:b w:val="0"/>
         </w:rPr>
         <w:t>Built rapport with regular guests and resolved feedback calmly, encouraging repeat bookings.</w:t>
+      </w:r>
+    </w:p>
+    <w:p>
+      <w:pPr>
+        <w:tabs>
+          <w:tab w:pos="10091" w:val="right"/>
+        </w:tabs>
+        <w:spacing w:after="60" w:before="200"/>
+      </w:pPr>
+      <w:r>
+        <w:rPr>
+          <w:b/>
+        </w:rPr>
+        <w:t>Front of House Staff</w:t>
+      </w:r>
+      <w:r>
+        <w:rPr>
+          <w:b w:val="0"/>
+        </w:rPr>
+        <w:t xml:space="preserve"> – Chit n Chaat, UK</w:t>
+      </w:r>
+      <w:r>
+        <w:rPr>
+          <w:b w:val="0"/>
+        </w:rPr>
+        <w:tab/>
+        <w:t>Feb 2024 – Jul 2024</w:t>
+      </w:r>
+    </w:p>
+    <w:p>
+      <w:pPr>
+        <w:pStyle w:val="ListBullet"/>
+        <w:spacing w:after="30"/>
+      </w:pPr>
+      <w:r>
+        <w:rPr>
+          <w:b w:val="0"/>
+        </w:rPr>
+        <w:t>Served eat-in and takeaway guests during high-volume shifts with speed and warmth.</w:t>
+      </w:r>
+    </w:p>
+    <w:p>
+      <w:pPr>
+        <w:pStyle w:val="ListBullet"/>
+        <w:spacing w:after="30"/>
+      </w:pPr>
+      <w:r>
+        <w:rPr>
+          <w:b w:val="0"/>
+        </w:rPr>
+        <w:t>Guided guests through the menu and handled special requests, helping them order with confidence.</w:t>
+      </w:r>
+    </w:p>
+    <w:p>
+      <w:pPr>
+        <w:pStyle w:val="ListBullet"/>
+        <w:spacing w:after="30"/>
+      </w:pPr>
+      <w:r>
+        <w:rPr>
+          <w:b w:val="0"/>
+        </w:rPr>
+        <w:t>Stepped in to support teammates in rush periods, cutting wait times and keeping service flowing.</w:t>
+      </w:r>
+    </w:p>
+    <w:p>
+      <w:pPr>
+        <w:pStyle w:val="ListBullet"/>
+        <w:spacing w:after="30"/>
+      </w:pPr>
+      <w:r>
+        <w:rPr>
+          <w:b w:val="0"/>
+        </w:rPr>
+        <w:t>Passed orders clearly to the kitchen so food went out quickly and accurately at busy times.</w:t>
+      </w:r>
+    </w:p>
+    <w:p>
+      <w:pPr>
+        <w:pStyle w:val="ListBullet"/>
+        <w:spacing w:after="30"/>
+      </w:pPr>
+      <w:r>
+        <w:rPr>
+          <w:b w:val="0"/>
+        </w:rPr>
+        <w:t>Kept the section clean, restocked and well presented in line with food safety standards.</w:t>
       </w:r>
     </w:p>
     <w:p>

</xml_diff>

<commit_message>
Hospitality CVs: add supervisor duties to Bardez role
Co-Authored-By: Claude Opus 5.5 <noreply@anthropic.com>
Claude-Session: https://claude.ai/code/session_01MNmMoUTURwQqNjm7K6SsYQ
</commit_message>
<xml_diff>
--- a/cv/Jithin_George_Server_CV.docx
+++ b/cv/Jithin_George_Server_CV.docx
@@ -239,6 +239,30 @@
         <w:rPr>
           <w:b w:val="0"/>
         </w:rPr>
+        <w:t>Ran the floor during shifts, allocating sections and keeping service on track at peak times.</w:t>
+      </w:r>
+    </w:p>
+    <w:p>
+      <w:pPr>
+        <w:pStyle w:val="ListBullet"/>
+        <w:spacing w:after="30"/>
+      </w:pPr>
+      <w:r>
+        <w:rPr>
+          <w:b w:val="0"/>
+        </w:rPr>
+        <w:t>Coached new team members on service standards, allergens and side duties during their first shifts.</w:t>
+      </w:r>
+    </w:p>
+    <w:p>
+      <w:pPr>
+        <w:pStyle w:val="ListBullet"/>
+        <w:spacing w:after="30"/>
+      </w:pPr>
+      <w:r>
+        <w:rPr>
+          <w:b w:val="0"/>
+        </w:rPr>
         <w:t>Greeted and seated guests, managed reservations and walk-ins, and kept table turnover smooth.</w:t>
       </w:r>
     </w:p>
@@ -275,18 +299,6 @@
         <w:rPr>
           <w:b w:val="0"/>
         </w:rPr>
-        <w:t>Upsold specials, sides and desserts to increase average spend per table.</w:t>
-      </w:r>
-    </w:p>
-    <w:p>
-      <w:pPr>
-        <w:pStyle w:val="ListBullet"/>
-        <w:spacing w:after="30"/>
-      </w:pPr>
-      <w:r>
-        <w:rPr>
-          <w:b w:val="0"/>
-        </w:rPr>
         <w:t>Handled allergen and dietary requests (vegan, gluten-free, nut allergies) accurately with the kitchen.</w:t>
       </w:r>
     </w:p>
@@ -312,18 +324,6 @@
           <w:b w:val="0"/>
         </w:rPr>
         <w:t>Completed side duties, table settings, polishing and restocking so the section was ready for every shift.</w:t>
-      </w:r>
-    </w:p>
-    <w:p>
-      <w:pPr>
-        <w:pStyle w:val="ListBullet"/>
-        <w:spacing w:after="30"/>
-      </w:pPr>
-      <w:r>
-        <w:rPr>
-          <w:b w:val="0"/>
-        </w:rPr>
-        <w:t>Built rapport with regular guests and resolved feedback calmly, encouraging repeat bookings.</w:t>
       </w:r>
     </w:p>
     <w:p>

</xml_diff>